<commit_message>
Building and vehicle listings done, interest rates almost done, vehicle table revised
</commit_message>
<xml_diff>
--- a/pyros_be/controllers/audit_template.docx
+++ b/pyros_be/controllers/audit_template.docx
@@ -93,7 +93,7 @@
     </w:p>
     <w:sdt>
       <w:sdtPr>
-        <w:id w:val="-608724887"/>
+        <w:id w:val="-1790596975"/>
         <w:docPartObj>
           <w:docPartGallery w:val="Table of Contents"/>
           <w:docPartUnique w:val="1"/>
@@ -2882,484 +2882,88 @@
         <w:t xml:space="preserve">A ${company_name}- az alábbi épületekkel rendelkezik:</w:t>
       </w:r>
     </w:p>
+    <w:p>
+      <w:pPr>
+        <w:rPr/>
+      </w:pPr>
+      <w:r>
+        <w:rPr>
+          <w:rtl w:val="0"/>
+        </w:rPr>
+        <w:t xml:space="preserve">${building_listing} </w:t>
+      </w:r>
+    </w:p>
+    <w:p>
+      <w:pPr>
+        <w:pStyle w:val="Heading1"/>
+        <w:rPr/>
+      </w:pPr>
+      <w:r>
+        <w:rPr>
+          <w:rtl w:val="0"/>
+        </w:rPr>
+        <w:t xml:space="preserve">Szállítás energetikai értékelése</w:t>
+      </w:r>
+    </w:p>
+    <w:p>
+      <w:pPr>
+        <w:rPr/>
+      </w:pPr>
+      <w:r>
+        <w:rPr>
+          <w:rtl w:val="0"/>
+        </w:rPr>
+        <w:t xml:space="preserve">A ${company_name} az alábbi járműveket üzemelteti:</w:t>
+      </w:r>
+    </w:p>
+    <w:p>
+      <w:pPr>
+        <w:rPr/>
+      </w:pPr>
+      <w:r>
+        <w:rPr>
+          <w:rtl w:val="0"/>
+        </w:rPr>
+        <w:t xml:space="preserve">${vehicle_listing}</w:t>
+      </w:r>
+    </w:p>
+    <w:p>
+      <w:pPr>
+        <w:rPr/>
+      </w:pPr>
+      <w:r>
+        <w:rPr>
+          <w:rtl w:val="0"/>
+        </w:rPr>
+        <w:t xml:space="preserve">${technology_page}</w:t>
+      </w:r>
+    </w:p>
+    <w:p>
+      <w:pPr>
+        <w:pStyle w:val="Heading1"/>
+        <w:rPr/>
+      </w:pPr>
+      <w:r>
+        <w:rPr>
+          <w:rtl w:val="0"/>
+        </w:rPr>
+        <w:t xml:space="preserve">A fogyasztások felosztása</w:t>
+      </w:r>
+    </w:p>
+    <w:p>
+      <w:pPr>
+        <w:rPr/>
+      </w:pPr>
+      <w:r>
+        <w:rPr>
+          <w:rtl w:val="0"/>
+        </w:rPr>
+        <w:t xml:space="preserve">A ${company_name} az ismertetett rendszerek mért vagy számított fogyasztásai alapján az alábbi energiafogyasztási profillal rendelkezik:</w:t>
+      </w:r>
+    </w:p>
     <w:tbl>
       <w:tblPr>
         <w:tblStyle w:val="Table4"/>
-        <w:tblW w:w="9016.000000000002" w:type="dxa"/>
-        <w:jc w:val="left"/>
-        <w:tblBorders>
-          <w:top w:color="000000" w:space="0" w:sz="4" w:val="single"/>
-          <w:left w:color="000000" w:space="0" w:sz="4" w:val="single"/>
-          <w:bottom w:color="000000" w:space="0" w:sz="4" w:val="single"/>
-          <w:right w:color="000000" w:space="0" w:sz="4" w:val="single"/>
-          <w:insideH w:color="000000" w:space="0" w:sz="4" w:val="single"/>
-          <w:insideV w:color="000000" w:space="0" w:sz="4" w:val="single"/>
-        </w:tblBorders>
-        <w:tblLayout w:type="fixed"/>
-        <w:tblLook w:val="0400"/>
-      </w:tblPr>
-      <w:tblGrid>
-        <w:gridCol w:w="2072"/>
-        <w:gridCol w:w="2369"/>
-        <w:gridCol w:w="2158"/>
-        <w:gridCol w:w="2417"/>
-        <w:tblGridChange w:id="0">
-          <w:tblGrid>
-            <w:gridCol w:w="2072"/>
-            <w:gridCol w:w="2369"/>
-            <w:gridCol w:w="2158"/>
-            <w:gridCol w:w="2417"/>
-          </w:tblGrid>
-        </w:tblGridChange>
-      </w:tblGrid>
-      <w:tr>
-        <w:trPr>
-          <w:cantSplit w:val="0"/>
-          <w:tblHeader w:val="0"/>
-        </w:trPr>
-        <w:tc>
-          <w:tcPr>
-            <w:shd w:fill="adadad" w:val="clear"/>
-          </w:tcPr>
-          <w:p>
-            <w:pPr>
-              <w:jc w:val="center"/>
-              <w:rPr>
-                <w:b w:val="1"/>
-                <w:bCs w:val="1"/>
-              </w:rPr>
-            </w:pPr>
-            <w:r>
-              <w:rPr>
-                <w:b w:val="1"/>
-                <w:bCs w:val="1"/>
-                <w:rtl w:val="0"/>
-              </w:rPr>
-              <w:t xml:space="preserve">Épület megnevezése</w:t>
-            </w:r>
-          </w:p>
-        </w:tc>
-        <w:tc>
-          <w:tcPr>
-            <w:shd w:fill="adadad" w:val="clear"/>
-          </w:tcPr>
-          <w:p>
-            <w:pPr>
-              <w:jc w:val="center"/>
-              <w:rPr>
-                <w:b w:val="1"/>
-                <w:bCs w:val="1"/>
-              </w:rPr>
-            </w:pPr>
-            <w:r>
-              <w:rPr>
-                <w:b w:val="1"/>
-                <w:bCs w:val="1"/>
-                <w:rtl w:val="0"/>
-              </w:rPr>
-              <w:t xml:space="preserve">Telephely</w:t>
-            </w:r>
-          </w:p>
-        </w:tc>
-        <w:tc>
-          <w:tcPr>
-            <w:shd w:fill="adadad" w:val="clear"/>
-          </w:tcPr>
-          <w:p>
-            <w:pPr>
-              <w:jc w:val="center"/>
-              <w:rPr>
-                <w:b w:val="1"/>
-                <w:bCs w:val="1"/>
-              </w:rPr>
-            </w:pPr>
-            <w:r>
-              <w:rPr>
-                <w:b w:val="1"/>
-                <w:bCs w:val="1"/>
-                <w:rtl w:val="0"/>
-              </w:rPr>
-              <w:t xml:space="preserve">Kalkulált fajlagos energiafelhasználás</w:t>
-            </w:r>
-          </w:p>
-        </w:tc>
-        <w:tc>
-          <w:tcPr>
-            <w:shd w:fill="adadad" w:val="clear"/>
-          </w:tcPr>
-          <w:p>
-            <w:pPr>
-              <w:jc w:val="center"/>
-              <w:rPr>
-                <w:b w:val="1"/>
-                <w:bCs w:val="1"/>
-              </w:rPr>
-            </w:pPr>
-            <w:r>
-              <w:rPr>
-                <w:b w:val="1"/>
-                <w:bCs w:val="1"/>
-                <w:rtl w:val="0"/>
-              </w:rPr>
-              <w:t xml:space="preserve">Besorolás</w:t>
-            </w:r>
-          </w:p>
-        </w:tc>
-      </w:tr>
-      <w:tr>
-        <w:trPr>
-          <w:cantSplit w:val="0"/>
-          <w:tblHeader w:val="0"/>
-        </w:trPr>
-        <w:tc>
-          <w:tcPr/>
-          <w:p>
-            <w:pPr>
-              <w:rPr/>
-            </w:pPr>
-            <w:r>
-              <w:rPr>
-                <w:rtl w:val="0"/>
-              </w:rPr>
-              <w:t xml:space="preserve">${building1_name}</w:t>
-            </w:r>
-          </w:p>
-        </w:tc>
-        <w:tc>
-          <w:tcPr/>
-          <w:p>
-            <w:pPr>
-              <w:rPr/>
-            </w:pPr>
-            <w:r>
-              <w:rPr>
-                <w:rtl w:val="0"/>
-              </w:rPr>
-              <w:t xml:space="preserve">${building1_complex}</w:t>
-            </w:r>
-          </w:p>
-        </w:tc>
-        <w:tc>
-          <w:tcPr/>
-          <w:p>
-            <w:pPr>
-              <w:rPr/>
-            </w:pPr>
-            <w:r>
-              <w:rPr>
-                <w:rtl w:val="0"/>
-              </w:rPr>
-              <w:t xml:space="preserve">${building1_calc}</w:t>
-            </w:r>
-          </w:p>
-        </w:tc>
-        <w:tc>
-          <w:tcPr/>
-          <w:p>
-            <w:pPr>
-              <w:rPr/>
-            </w:pPr>
-            <w:r>
-              <w:rPr>
-                <w:rtl w:val="0"/>
-              </w:rPr>
-              <w:t xml:space="preserve">Fejlesztendő/Megfelelő</w:t>
-            </w:r>
-          </w:p>
-        </w:tc>
-      </w:tr>
-    </w:tbl>
-    <w:p>
-      <w:pPr>
-        <w:rPr/>
-      </w:pPr>
-      <w:r>
-        <w:rPr>
-          <w:rtl w:val="0"/>
-        </w:rPr>
-      </w:r>
-    </w:p>
-    <w:p>
-      <w:pPr>
-        <w:pStyle w:val="Heading1"/>
-        <w:rPr/>
-      </w:pPr>
-      <w:r>
-        <w:rPr>
-          <w:rtl w:val="0"/>
-        </w:rPr>
-        <w:t xml:space="preserve">Szállítás energetikai értékelése</w:t>
-      </w:r>
-    </w:p>
-    <w:p>
-      <w:pPr>
-        <w:rPr/>
-      </w:pPr>
-      <w:r>
-        <w:rPr>
-          <w:rtl w:val="0"/>
-        </w:rPr>
-        <w:t xml:space="preserve">A ${company_name} az alábbi járműveket üzemelteti:</w:t>
-      </w:r>
-    </w:p>
-    <w:tbl>
-      <w:tblPr>
-        <w:tblStyle w:val="Table5"/>
-        <w:tblW w:w="9016.0" w:type="dxa"/>
-        <w:jc w:val="left"/>
-        <w:tblBorders>
-          <w:top w:color="000000" w:space="0" w:sz="4" w:val="single"/>
-          <w:left w:color="000000" w:space="0" w:sz="4" w:val="single"/>
-          <w:bottom w:color="000000" w:space="0" w:sz="4" w:val="single"/>
-          <w:right w:color="000000" w:space="0" w:sz="4" w:val="single"/>
-          <w:insideH w:color="000000" w:space="0" w:sz="4" w:val="single"/>
-          <w:insideV w:color="000000" w:space="0" w:sz="4" w:val="single"/>
-        </w:tblBorders>
-        <w:tblLayout w:type="fixed"/>
-        <w:tblLook w:val="0400"/>
-      </w:tblPr>
-      <w:tblGrid>
-        <w:gridCol w:w="2014"/>
-        <w:gridCol w:w="2319"/>
-        <w:gridCol w:w="2209"/>
-        <w:gridCol w:w="2474"/>
-        <w:tblGridChange w:id="0">
-          <w:tblGrid>
-            <w:gridCol w:w="2014"/>
-            <w:gridCol w:w="2319"/>
-            <w:gridCol w:w="2209"/>
-            <w:gridCol w:w="2474"/>
-          </w:tblGrid>
-        </w:tblGridChange>
-      </w:tblGrid>
-      <w:tr>
-        <w:trPr>
-          <w:cantSplit w:val="0"/>
-          <w:trHeight w:val="761" w:hRule="atLeast"/>
-          <w:tblHeader w:val="0"/>
-        </w:trPr>
-        <w:tc>
-          <w:tcPr>
-            <w:shd w:fill="adadad" w:val="clear"/>
-          </w:tcPr>
-          <w:p>
-            <w:pPr>
-              <w:jc w:val="center"/>
-              <w:rPr>
-                <w:b w:val="1"/>
-                <w:bCs w:val="1"/>
-              </w:rPr>
-            </w:pPr>
-            <w:r>
-              <w:rPr>
-                <w:b w:val="1"/>
-                <w:bCs w:val="1"/>
-                <w:rtl w:val="0"/>
-              </w:rPr>
-              <w:t xml:space="preserve">Jármű megnevezése</w:t>
-            </w:r>
-          </w:p>
-        </w:tc>
-        <w:tc>
-          <w:tcPr>
-            <w:shd w:fill="adadad" w:val="clear"/>
-          </w:tcPr>
-          <w:p>
-            <w:pPr>
-              <w:jc w:val="center"/>
-              <w:rPr>
-                <w:b w:val="1"/>
-                <w:bCs w:val="1"/>
-              </w:rPr>
-            </w:pPr>
-            <w:r>
-              <w:rPr>
-                <w:b w:val="1"/>
-                <w:bCs w:val="1"/>
-                <w:rtl w:val="0"/>
-              </w:rPr>
-              <w:t xml:space="preserve">Telephely</w:t>
-            </w:r>
-          </w:p>
-        </w:tc>
-        <w:tc>
-          <w:tcPr>
-            <w:shd w:fill="adadad" w:val="clear"/>
-          </w:tcPr>
-          <w:p>
-            <w:pPr>
-              <w:jc w:val="center"/>
-              <w:rPr>
-                <w:b w:val="1"/>
-                <w:bCs w:val="1"/>
-              </w:rPr>
-            </w:pPr>
-            <w:r>
-              <w:rPr>
-                <w:b w:val="1"/>
-                <w:bCs w:val="1"/>
-                <w:rtl w:val="0"/>
-              </w:rPr>
-              <w:t xml:space="preserve">Kalkulált fajlagos energiafelhasználás</w:t>
-            </w:r>
-          </w:p>
-        </w:tc>
-        <w:tc>
-          <w:tcPr>
-            <w:shd w:fill="adadad" w:val="clear"/>
-          </w:tcPr>
-          <w:p>
-            <w:pPr>
-              <w:jc w:val="center"/>
-              <w:rPr>
-                <w:b w:val="1"/>
-                <w:bCs w:val="1"/>
-              </w:rPr>
-            </w:pPr>
-            <w:r>
-              <w:rPr>
-                <w:b w:val="1"/>
-                <w:bCs w:val="1"/>
-                <w:rtl w:val="0"/>
-              </w:rPr>
-              <w:t xml:space="preserve">Besorolás</w:t>
-            </w:r>
-          </w:p>
-        </w:tc>
-      </w:tr>
-      <w:tr>
-        <w:trPr>
-          <w:cantSplit w:val="0"/>
-          <w:tblHeader w:val="0"/>
-        </w:trPr>
-        <w:tc>
-          <w:tcPr/>
-          <w:p>
-            <w:pPr>
-              <w:rPr/>
-            </w:pPr>
-            <w:r>
-              <w:rPr>
-                <w:rtl w:val="0"/>
-              </w:rPr>
-              <w:t xml:space="preserve">${vehicle1_name}</w:t>
-            </w:r>
-          </w:p>
-        </w:tc>
-        <w:tc>
-          <w:tcPr/>
-          <w:p>
-            <w:pPr>
-              <w:rPr/>
-            </w:pPr>
-            <w:r>
-              <w:rPr>
-                <w:rtl w:val="0"/>
-              </w:rPr>
-              <w:t xml:space="preserve">${vehicle1_complex}</w:t>
-            </w:r>
-          </w:p>
-        </w:tc>
-        <w:tc>
-          <w:tcPr/>
-          <w:p>
-            <w:pPr>
-              <w:rPr/>
-            </w:pPr>
-            <w:r>
-              <w:rPr>
-                <w:rtl w:val="0"/>
-              </w:rPr>
-              <w:t xml:space="preserve">${vehicle1_calc}</w:t>
-            </w:r>
-          </w:p>
-        </w:tc>
-        <w:tc>
-          <w:tcPr/>
-          <w:p>
-            <w:pPr>
-              <w:rPr/>
-            </w:pPr>
-            <w:r>
-              <w:rPr>
-                <w:rtl w:val="0"/>
-              </w:rPr>
-              <w:t xml:space="preserve">Fejlesztendő/Megfelelő</w:t>
-            </w:r>
-          </w:p>
-        </w:tc>
-      </w:tr>
-    </w:tbl>
-    <w:p>
-      <w:pPr>
-        <w:rPr/>
-      </w:pPr>
-      <w:r>
-        <w:rPr>
-          <w:rtl w:val="0"/>
-        </w:rPr>
-      </w:r>
-    </w:p>
-    <w:p>
-      <w:pPr>
-        <w:pStyle w:val="Heading1"/>
-        <w:rPr/>
-      </w:pPr>
-      <w:r>
-        <w:rPr>
-          <w:rtl w:val="0"/>
-        </w:rPr>
-        <w:t xml:space="preserve">${Technológiai alrendszerek}</w:t>
-      </w:r>
-    </w:p>
-    <w:p>
-      <w:pPr>
-        <w:rPr/>
-      </w:pPr>
-      <w:r>
-        <w:rPr>
-          <w:rtl w:val="0"/>
-        </w:rPr>
-        <w:t xml:space="preserve">(ha van, akkor történik itt bármi is, egyébként ezt a részt teljesen átugorja)</w:t>
-      </w:r>
-    </w:p>
-    <w:p>
-      <w:pPr>
-        <w:rPr/>
-      </w:pPr>
-      <w:r>
-        <w:rPr>
-          <w:rtl w:val="0"/>
-        </w:rPr>
-        <w:t xml:space="preserve">A ${company_name}-nál/nél az alábbi technológiai alrendszerek kerültek kialakításra:</w:t>
-      </w:r>
-    </w:p>
-    <w:p>
-      <w:pPr>
-        <w:pStyle w:val="Heading1"/>
-        <w:rPr/>
-      </w:pPr>
-      <w:r>
-        <w:rPr>
-          <w:rtl w:val="0"/>
-        </w:rPr>
-        <w:t xml:space="preserve">A fogyasztások felosztása</w:t>
-      </w:r>
-    </w:p>
-    <w:p>
-      <w:pPr>
-        <w:rPr/>
-      </w:pPr>
-      <w:r>
-        <w:rPr>
-          <w:rtl w:val="0"/>
-        </w:rPr>
-        <w:t xml:space="preserve">A ${company_name} az ismertetett rendszerek mért vagy számított fogyasztásai alapján az alábbi energiafogyasztási profillal rendelkezik:</w:t>
-      </w:r>
-    </w:p>
-    <w:tbl>
-      <w:tblPr>
-        <w:tblStyle w:val="Table6"/>
         <w:tblW w:w="8296.0" w:type="dxa"/>
         <w:jc w:val="left"/>
         <w:tblInd w:w="720.0" w:type="dxa"/>
@@ -4479,7 +4083,7 @@
     </w:p>
     <w:tbl>
       <w:tblPr>
-        <w:tblStyle w:val="Table7"/>
+        <w:tblStyle w:val="Table5"/>
         <w:tblW w:w="9016.0" w:type="dxa"/>
         <w:jc w:val="left"/>
         <w:tblBorders>
@@ -4885,38 +4489,6 @@
     </w:tblPr>
   </w:style>
   <w:style w:type="table" w:styleId="Table5">
-    <w:basedOn w:val="TableNormal"/>
-    <w:pPr>
-      <w:spacing w:after="0" w:line="240" w:lineRule="auto"/>
-    </w:pPr>
-    <w:tblPr>
-      <w:tblStyleRowBandSize w:val="1"/>
-      <w:tblStyleColBandSize w:val="1"/>
-      <w:tblCellMar>
-        <w:top w:w="0.0" w:type="dxa"/>
-        <w:left w:w="108.0" w:type="dxa"/>
-        <w:bottom w:w="0.0" w:type="dxa"/>
-        <w:right w:w="108.0" w:type="dxa"/>
-      </w:tblCellMar>
-    </w:tblPr>
-  </w:style>
-  <w:style w:type="table" w:styleId="Table6">
-    <w:basedOn w:val="TableNormal"/>
-    <w:pPr>
-      <w:spacing w:after="0" w:line="240" w:lineRule="auto"/>
-    </w:pPr>
-    <w:tblPr>
-      <w:tblStyleRowBandSize w:val="1"/>
-      <w:tblStyleColBandSize w:val="1"/>
-      <w:tblCellMar>
-        <w:top w:w="0.0" w:type="dxa"/>
-        <w:left w:w="108.0" w:type="dxa"/>
-        <w:bottom w:w="0.0" w:type="dxa"/>
-        <w:right w:w="108.0" w:type="dxa"/>
-      </w:tblCellMar>
-    </w:tblPr>
-  </w:style>
-  <w:style w:type="table" w:styleId="Table7">
     <w:basedOn w:val="TableNormal"/>
     <w:pPr>
       <w:spacing w:after="0" w:line="240" w:lineRule="auto"/>

</xml_diff>